<commit_message>
feat: consolidate routing into RBAC assignment, remove routing rules, and align department & triage models
</commit_message>
<xml_diff>
--- a/docs/Grievance Management Module.docx
+++ b/docs/Grievance Management Module.docx
@@ -1,6 +1,6 @@
 
 <file path=word/document.xml><?xml version="1.0" encoding="utf-8"?>
-<w:document xmlns:w="http://schemas.openxmlformats.org/wordprocessingml/2006/main" xmlns:m="http://schemas.openxmlformats.org/officeDocument/2006/math" xmlns:r="http://schemas.openxmlformats.org/officeDocument/2006/relationships" xmlns:o="urn:schemas-microsoft-com:office:office" xmlns:v="urn:schemas-microsoft-com:vml" xmlns:w10="urn:schemas-microsoft-com:office:word" xmlns:a="http://schemas.openxmlformats.org/drawingml/2006/main" xmlns:pic="http://schemas.openxmlformats.org/drawingml/2006/picture" xmlns:wp="http://schemas.openxmlformats.org/drawingml/2006/wordprocessingDrawing">
+<w:document xmlns:a="http://schemas.openxmlformats.org/drawingml/2006/main" xmlns:pic="http://schemas.openxmlformats.org/drawingml/2006/picture" xmlns:r="http://schemas.openxmlformats.org/officeDocument/2006/relationships" xmlns:w="http://schemas.openxmlformats.org/wordprocessingml/2006/main" xmlns:wp="http://schemas.openxmlformats.org/drawingml/2006/wordprocessingDrawing">
   <w:body>
     <w:p>
       <w:pPr>
@@ -760,7 +760,7 @@
               <w:pStyle w:val="Compact"/>
             </w:pPr>
             <w:r>
-              <w:t xml:space="preserve">Submitters and reference data</w:t>
+              <w:t xml:space="preserve">Administrative areas and reference data</w:t>
             </w:r>
           </w:p>
         </w:tc>
@@ -784,7 +784,7 @@
               <w:pStyle w:val="Compact"/>
             </w:pPr>
             <w:r>
-              <w:t xml:space="preserve">Drafts</w:t>
+              <w:t xml:space="preserve">Case Submission</w:t>
             </w:r>
           </w:p>
         </w:tc>
@@ -832,7 +832,7 @@
               <w:pStyle w:val="Compact"/>
             </w:pPr>
             <w:r>
-              <w:t xml:space="preserve">Grievances — read</w:t>
+              <w:t xml:space="preserve">Cases — read</w:t>
             </w:r>
           </w:p>
         </w:tc>
@@ -856,7 +856,7 @@
               <w:pStyle w:val="Compact"/>
             </w:pPr>
             <w:r>
-              <w:t xml:space="preserve">Grievances — lifecycle and conversation</w:t>
+              <w:t xml:space="preserve">Cases — lifecycle, actions and communication</w:t>
             </w:r>
           </w:p>
         </w:tc>
@@ -976,7 +976,7 @@
               <w:pStyle w:val="Compact"/>
             </w:pPr>
             <w:r>
-              <w:t xml:space="preserve">Dashboard, metrics and analytics</w:t>
+              <w:t xml:space="preserve">Reports &amp; analytics</w:t>
             </w:r>
           </w:p>
         </w:tc>
@@ -1000,7 +1000,7 @@
               <w:pStyle w:val="Compact"/>
             </w:pPr>
             <w:r>
-              <w:t xml:space="preserve">Case actions</w:t>
+              <w:t xml:space="preserve">Case triage &amp; SLA operations</w:t>
             </w:r>
           </w:p>
         </w:tc>
@@ -1324,7 +1324,7 @@
               <w:pStyle w:val="Compact"/>
             </w:pPr>
             <w:r>
-              <w:t xml:space="preserve">Full administrative access: users, routing rules, SLA policy, notification templates, and audit records (view only — never delete)</w:t>
+              <w:t xml:space="preserve">Full administrative access: users, RBAC assignment rules, SLA policy, notification templates, and audit records (view only — never delete)</w:t>
             </w:r>
           </w:p>
         </w:tc>
@@ -1792,7 +1792,7 @@
         <w:pStyle w:val="FirstParagraph"/>
       </w:pPr>
       <w:r>
-        <w:t xml:space="preserve">Internal staff provisioning, separate from the citizen path in 2.3. There is no officer self-registration: the admin creates the account, the service issues a temporary password, and the officer sets their own password at first sign-in. Ends with the new officer selectable in 2.1’s routing rules.</w:t>
+        <w:t xml:space="preserve">Internal staff provisioning, separate from the citizen path in 2.3. There is no officer self-registration: the admin creates the account, the service issues a temporary password, and the officer sets their own password at first sign-in. Ends with the new officer selectable in 2.1’s RBAC assignment rules.</w:t>
       </w:r>
     </w:p>
     <w:p>
@@ -1962,7 +1962,7 @@
         <w:pStyle w:val="FirstParagraph"/>
       </w:pPr>
       <w:r>
-        <w:t xml:space="preserve">What happens between a case being submitted and an officer holding it. A routing rule match assigns straight through. Everything else — no matching rule, or an IVR call or inbound email that never named a category — is filed under</w:t>
+        <w:t xml:space="preserve">What happens between a case being submitted and an officer holding it. An RBAC assignment match assigns straight through. Everything else — no matching rule, or an IVR call or inbound email that never named a category — is filed under</w:t>
       </w:r>
       <w:r>
         <w:t xml:space="preserve"> </w:t>
@@ -2568,7 +2568,7 @@
           <w:i/>
           <w:iCs/>
         </w:rPr>
-        <w:t xml:space="preserve">An infected file is quarantined rather than silently dropped, and the submitter is told, because a farmer who believes their evidence is attached will not send it again. Files uploaded against a draft re-parent onto the case when the draft is submitted.</w:t>
+        <w:t xml:space="preserve">An infected file is quarantined rather than silently dropped, and the submitter is told, because a farmer who believes their evidence is attached will not send it again. Files uploaded as supporting evidence are attached and linked to the case upon submission.</w:t>
       </w:r>
     </w:p>
     <w:bookmarkEnd w:id="57"/>
@@ -2872,7 +2872,7 @@
               <w:pStyle w:val="Compact"/>
             </w:pPr>
             <w:r>
-              <w:t xml:space="preserve">/api/v1/grievances/health</w:t>
+              <w:t xml:space="preserve">/api/v1/services/health</w:t>
             </w:r>
           </w:p>
         </w:tc>
@@ -2918,7 +2918,7 @@
               <w:pStyle w:val="Compact"/>
             </w:pPr>
             <w:r>
-              <w:t xml:space="preserve">/api/v1/grievances/ping</w:t>
+              <w:t xml:space="preserve">/api/v1/services/ping</w:t>
             </w:r>
           </w:p>
         </w:tc>
@@ -2953,7 +2953,7 @@
         <w:pStyle w:val="Heading2"/>
       </w:pPr>
       <w:r>
-        <w:t xml:space="preserve">3.2 Submitters &amp; reference data</w:t>
+        <w:t xml:space="preserve">3.2 Administrative areas &amp; reference data</w:t>
       </w:r>
     </w:p>
     <w:tbl>
@@ -3037,18 +3037,18 @@
               <w:pStyle w:val="Compact"/>
             </w:pPr>
             <w:r>
-              <w:t xml:space="preserve">/api/v1/submitters/options</w:t>
-            </w:r>
-          </w:p>
-        </w:tc>
-        <w:tc>
-          <w:tcPr/>
-          <w:p>
-            <w:pPr>
-              <w:pStyle w:val="Compact"/>
-            </w:pPr>
-            <w:r>
-              <w:t xml:space="preserve">Dropdown options and reference data for the intake form</w:t>
+              <w:t xml:space="preserve">/api/v1/areas</w:t>
+            </w:r>
+          </w:p>
+        </w:tc>
+        <w:tc>
+          <w:tcPr/>
+          <w:p>
+            <w:pPr>
+              <w:pStyle w:val="Compact"/>
+            </w:pPr>
+            <w:r>
+              <w:t xml:space="preserve">Cascading area drill-down, or text search</w:t>
             </w:r>
           </w:p>
         </w:tc>
@@ -3083,53 +3083,7 @@
               <w:pStyle w:val="Compact"/>
             </w:pPr>
             <w:r>
-              <w:t xml:space="preserve">/api/v1/administrative-areas</w:t>
-            </w:r>
-          </w:p>
-        </w:tc>
-        <w:tc>
-          <w:tcPr/>
-          <w:p>
-            <w:pPr>
-              <w:pStyle w:val="Compact"/>
-            </w:pPr>
-            <w:r>
-              <w:t xml:space="preserve">Cascading area drill-down, or text search</w:t>
-            </w:r>
-          </w:p>
-        </w:tc>
-        <w:tc>
-          <w:tcPr/>
-          <w:p>
-            <w:pPr>
-              <w:pStyle w:val="Compact"/>
-            </w:pPr>
-            <w:r>
-              <w:t xml:space="preserve">Public</w:t>
-            </w:r>
-          </w:p>
-        </w:tc>
-      </w:tr>
-      <w:tr>
-        <w:tc>
-          <w:tcPr/>
-          <w:p>
-            <w:pPr>
-              <w:pStyle w:val="Compact"/>
-            </w:pPr>
-            <w:r>
-              <w:t xml:space="preserve">GET</w:t>
-            </w:r>
-          </w:p>
-        </w:tc>
-        <w:tc>
-          <w:tcPr/>
-          <w:p>
-            <w:pPr>
-              <w:pStyle w:val="Compact"/>
-            </w:pPr>
-            <w:r>
-              <w:t xml:space="preserve">/api/v1/administrative-areas/{area_id_or_path}/ancestors</w:t>
+              <w:t xml:space="preserve">/api/v1/areas/{area_id_or_path}/ancestors</w:t>
             </w:r>
           </w:p>
         </w:tc>
@@ -3158,13 +3112,13 @@
       </w:tr>
     </w:tbl>
     <w:bookmarkEnd w:id="64"/>
-    <w:bookmarkStart w:id="65" w:name="drafts"/>
+    <w:bookmarkStart w:id="65" w:name="case-submission"/>
     <w:p>
       <w:pPr>
         <w:pStyle w:val="Heading2"/>
       </w:pPr>
       <w:r>
-        <w:t xml:space="preserve">3.3 Drafts</w:t>
+        <w:t xml:space="preserve">3.3 Case Submission</w:t>
       </w:r>
     </w:p>
     <w:p>
@@ -3172,22 +3126,7 @@
         <w:pStyle w:val="FirstParagraph"/>
       </w:pPr>
       <w:r>
-        <w:t xml:space="preserve">The whole draft surface is authenticated: a submitter signs in first, then builds the case.</w:t>
-      </w:r>
-      <w:r>
-        <w:t xml:space="preserve"> </w:t>
-      </w:r>
-      <w:r>
-        <w:rPr>
-          <w:rStyle w:val="VerbatimChar"/>
-        </w:rPr>
-        <w:t xml:space="preserve">client_uuid</w:t>
-      </w:r>
-      <w:r>
-        <w:t xml:space="preserve"> </w:t>
-      </w:r>
-      <w:r>
-        <w:t xml:space="preserve">identifies which draft a call refers to across devices and sessions — it is not a credential, and it never stands in for a token. Every route below resolves the draft against the signed-in owner and refuses a draft belonging to anyone else.</w:t>
+        <w:t xml:space="preserve">The case submission endpoint accepts filings across mobile app, web portal, and partner intake channels. It validates mandatory fields, verifies deduplication, mints the official ticket number, and triggers auto-routing in one direct step.</w:t>
       </w:r>
     </w:p>
     <w:tbl>
@@ -3271,222 +3210,29 @@
               <w:pStyle w:val="Compact"/>
             </w:pPr>
             <w:r>
-              <w:t xml:space="preserve">/api/v1/drafts</w:t>
-            </w:r>
-          </w:p>
-        </w:tc>
-        <w:tc>
-          <w:tcPr/>
-          <w:p>
-            <w:pPr>
-              <w:pStyle w:val="Compact"/>
-            </w:pPr>
-            <w:r>
-              <w:t xml:space="preserve">Save or update the submitter’s draft, keyed by</w:t>
-            </w:r>
-            <w:r>
-              <w:t xml:space="preserve"> </w:t>
-            </w:r>
-            <w:r>
-              <w:rPr>
-                <w:rStyle w:val="VerbatimChar"/>
-              </w:rPr>
-              <w:t xml:space="preserve">client_uuid</w:t>
-            </w:r>
-          </w:p>
-        </w:tc>
-        <w:tc>
-          <w:tcPr/>
-          <w:p>
-            <w:pPr>
-              <w:pStyle w:val="Compact"/>
-            </w:pPr>
-            <w:r>
-              <w:t xml:space="preserve">Authenticated submitter</w:t>
-            </w:r>
-          </w:p>
-        </w:tc>
-      </w:tr>
-      <w:tr>
-        <w:tc>
-          <w:tcPr/>
-          <w:p>
-            <w:pPr>
-              <w:pStyle w:val="Compact"/>
-            </w:pPr>
-            <w:r>
-              <w:t xml:space="preserve">GET</w:t>
-            </w:r>
-          </w:p>
-        </w:tc>
-        <w:tc>
-          <w:tcPr/>
-          <w:p>
-            <w:pPr>
-              <w:pStyle w:val="Compact"/>
-            </w:pPr>
-            <w:r>
-              <w:t xml:space="preserve">/api/v1/drafts</w:t>
-            </w:r>
-          </w:p>
-        </w:tc>
-        <w:tc>
-          <w:tcPr/>
-          <w:p>
-            <w:pPr>
-              <w:pStyle w:val="Compact"/>
-            </w:pPr>
-            <w:r>
-              <w:t xml:space="preserve">Load the submitter’s latest draft</w:t>
-            </w:r>
-          </w:p>
-        </w:tc>
-        <w:tc>
-          <w:tcPr/>
-          <w:p>
-            <w:pPr>
-              <w:pStyle w:val="Compact"/>
-            </w:pPr>
-            <w:r>
-              <w:t xml:space="preserve">Authenticated submitter, own draft</w:t>
-            </w:r>
-          </w:p>
-        </w:tc>
-      </w:tr>
-      <w:tr>
-        <w:tc>
-          <w:tcPr/>
-          <w:p>
-            <w:pPr>
-              <w:pStyle w:val="Compact"/>
-            </w:pPr>
-            <w:r>
-              <w:t xml:space="preserve">DELETE</w:t>
-            </w:r>
-          </w:p>
-        </w:tc>
-        <w:tc>
-          <w:tcPr/>
-          <w:p>
-            <w:pPr>
-              <w:pStyle w:val="Compact"/>
-            </w:pPr>
-            <w:r>
-              <w:t xml:space="preserve">/api/v1/drafts</w:t>
-            </w:r>
-          </w:p>
-        </w:tc>
-        <w:tc>
-          <w:tcPr/>
-          <w:p>
-            <w:pPr>
-              <w:pStyle w:val="Compact"/>
-            </w:pPr>
-            <w:r>
-              <w:t xml:space="preserve">Discard a draft and purge its uploads</w:t>
-            </w:r>
-          </w:p>
-        </w:tc>
-        <w:tc>
-          <w:tcPr/>
-          <w:p>
-            <w:pPr>
-              <w:pStyle w:val="Compact"/>
-            </w:pPr>
-            <w:r>
-              <w:t xml:space="preserve">Authenticated submitter, own draft</w:t>
-            </w:r>
-          </w:p>
-        </w:tc>
-      </w:tr>
-      <w:tr>
-        <w:tc>
-          <w:tcPr/>
-          <w:p>
-            <w:pPr>
-              <w:pStyle w:val="Compact"/>
-            </w:pPr>
-            <w:r>
-              <w:t xml:space="preserve">POST</w:t>
-            </w:r>
-          </w:p>
-        </w:tc>
-        <w:tc>
-          <w:tcPr/>
-          <w:p>
-            <w:pPr>
-              <w:pStyle w:val="Compact"/>
-            </w:pPr>
-            <w:r>
-              <w:t xml:space="preserve">/api/v1/drafts/attachments</w:t>
-            </w:r>
-          </w:p>
-        </w:tc>
-        <w:tc>
-          <w:tcPr/>
-          <w:p>
-            <w:pPr>
-              <w:pStyle w:val="Compact"/>
-            </w:pPr>
-            <w:r>
-              <w:t xml:space="preserve">Attach a supporting document to a draft</w:t>
-            </w:r>
-          </w:p>
-        </w:tc>
-        <w:tc>
-          <w:tcPr/>
-          <w:p>
-            <w:pPr>
-              <w:pStyle w:val="Compact"/>
-            </w:pPr>
-            <w:r>
-              <w:t xml:space="preserve">Authenticated submitter, own draft</w:t>
-            </w:r>
-          </w:p>
-        </w:tc>
-      </w:tr>
-      <w:tr>
-        <w:tc>
-          <w:tcPr/>
-          <w:p>
-            <w:pPr>
-              <w:pStyle w:val="Compact"/>
-            </w:pPr>
-            <w:r>
-              <w:t xml:space="preserve">POST</w:t>
-            </w:r>
-          </w:p>
-        </w:tc>
-        <w:tc>
-          <w:tcPr/>
-          <w:p>
-            <w:pPr>
-              <w:pStyle w:val="Compact"/>
-            </w:pPr>
-            <w:r>
-              <w:t xml:space="preserve">/api/v1/drafts/submit</w:t>
-            </w:r>
-          </w:p>
-        </w:tc>
-        <w:tc>
-          <w:tcPr/>
-          <w:p>
-            <w:pPr>
-              <w:pStyle w:val="Compact"/>
-            </w:pPr>
-            <w:r>
-              <w:t xml:space="preserve">Move the draft from Draft to Submitted; issues the ticket number and triggers routing</w:t>
-            </w:r>
-          </w:p>
-        </w:tc>
-        <w:tc>
-          <w:tcPr/>
-          <w:p>
-            <w:pPr>
-              <w:pStyle w:val="Compact"/>
-            </w:pPr>
-            <w:r>
-              <w:t xml:space="preserve">Authenticated submitter</w:t>
+              <w:t xml:space="preserve">/api/v1/cases</w:t>
+            </w:r>
+          </w:p>
+        </w:tc>
+        <w:tc>
+          <w:tcPr/>
+          <w:p>
+            <w:pPr>
+              <w:pStyle w:val="Compact"/>
+            </w:pPr>
+            <w:r>
+              <w:t xml:space="preserve">Submit a new case: records intake channel, submitter details, category, type, description, and attached evidence. Validates, checks deduplication, issues ticket number, and triggers auto-routing.</w:t>
+            </w:r>
+          </w:p>
+        </w:tc>
+        <w:tc>
+          <w:tcPr/>
+          <w:p>
+            <w:pPr>
+              <w:pStyle w:val="Compact"/>
+            </w:pPr>
+            <w:r>
+              <w:t xml:space="preserve">Authenticated submitter or Partner API key</w:t>
             </w:r>
           </w:p>
         </w:tc>
@@ -3510,7 +3256,7 @@
         <w:rPr>
           <w:rStyle w:val="VerbatimChar"/>
         </w:rPr>
-        <w:t xml:space="preserve">POST /api/v1/grievances</w:t>
+        <w:t xml:space="preserve">POST /api/v1/cases</w:t>
       </w:r>
       <w:r>
         <w:t xml:space="preserve"> </w:t>
@@ -3600,7 +3346,7 @@
               <w:pStyle w:val="Compact"/>
             </w:pPr>
             <w:r>
-              <w:t xml:space="preserve">/api/v1/grievances</w:t>
+              <w:t xml:space="preserve">/api/v1/cases</w:t>
             </w:r>
           </w:p>
         </w:tc>
@@ -3630,22 +3376,10 @@
     </w:tbl>
     <w:p>
       <w:pPr>
-        <w:pStyle w:val="BodyText"/>
-      </w:pPr>
-      <w:r>
-        <w:t xml:space="preserve">A submitter using the mobile app or the web portal does not go through this route — they build a draft and call</w:t>
-      </w:r>
-      <w:r>
-        <w:t xml:space="preserve"> </w:t>
-      </w:r>
-      <w:r>
-        <w:rPr>
-          <w:rStyle w:val="VerbatimChar"/>
-        </w:rPr>
-        <w:t xml:space="preserve">POST /api/v1/drafts/submit</w:t>
-      </w:r>
-      <w:r>
-        <w:t xml:space="preserve">.</w:t>
+        <w:pStyle w:val="FirstParagraph"/>
+      </w:pPr>
+      <w:r>
+        <w:t xml:space="preserve">Submitters across all channels use the unified case submission route (POST /api/v1/cases).</w:t>
       </w:r>
     </w:p>
     <w:p>
@@ -3799,7 +3533,7 @@
               <w:pStyle w:val="Compact"/>
             </w:pPr>
             <w:r>
-              <w:t xml:space="preserve">/api/v1/grievances/{ticket_number}/verify</w:t>
+              <w:t xml:space="preserve">/api/v1/cases/{ticket_number}/verify</w:t>
             </w:r>
           </w:p>
         </w:tc>
@@ -3842,7 +3576,7 @@
         <w:pStyle w:val="Heading2"/>
       </w:pPr>
       <w:r>
-        <w:t xml:space="preserve">3.5 Grievances — read</w:t>
+        <w:t xml:space="preserve">3.5 Cases — read</w:t>
       </w:r>
     </w:p>
     <w:tbl>
@@ -3926,7 +3660,7 @@
               <w:pStyle w:val="Compact"/>
             </w:pPr>
             <w:r>
-              <w:t xml:space="preserve">/api/v1/grievances</w:t>
+              <w:t xml:space="preserve">/api/v1/cases</w:t>
             </w:r>
           </w:p>
         </w:tc>
@@ -3972,29 +3706,29 @@
               <w:pStyle w:val="Compact"/>
             </w:pPr>
             <w:r>
-              <w:t xml:space="preserve">/api/v1/grievances/options</w:t>
-            </w:r>
-          </w:p>
-        </w:tc>
-        <w:tc>
-          <w:tcPr/>
-          <w:p>
-            <w:pPr>
-              <w:pStyle w:val="Compact"/>
-            </w:pPr>
-            <w:r>
-              <w:t xml:space="preserve">Management options and dropdowns</w:t>
-            </w:r>
-          </w:p>
-        </w:tc>
-        <w:tc>
-          <w:tcPr/>
-          <w:p>
-            <w:pPr>
-              <w:pStyle w:val="Compact"/>
-            </w:pPr>
-            <w:r>
-              <w:t xml:space="preserve">Authenticated</w:t>
+              <w:t xml:space="preserve">/api/v1/cases/options</w:t>
+            </w:r>
+          </w:p>
+        </w:tc>
+        <w:tc>
+          <w:tcPr/>
+          <w:p>
+            <w:pPr>
+              <w:pStyle w:val="Compact"/>
+            </w:pPr>
+            <w:r>
+              <w:t xml:space="preserve">Public intake and submission options (submitter types, identity schemes, service categories, grievance types, intake channels, languages, dialing prefixes)</w:t>
+            </w:r>
+          </w:p>
+        </w:tc>
+        <w:tc>
+          <w:tcPr/>
+          <w:p>
+            <w:pPr>
+              <w:pStyle w:val="Compact"/>
+            </w:pPr>
+            <w:r>
+              <w:t xml:space="preserve">Public</w:t>
             </w:r>
           </w:p>
         </w:tc>
@@ -4018,7 +3752,7 @@
               <w:pStyle w:val="Compact"/>
             </w:pPr>
             <w:r>
-              <w:t xml:space="preserve">/api/v1/grievances/{ticket_number}</w:t>
+              <w:t xml:space="preserve">/api/v1/cases/{ticket_number}</w:t>
             </w:r>
           </w:p>
         </w:tc>
@@ -4053,7 +3787,7 @@
         <w:pStyle w:val="Heading2"/>
       </w:pPr>
       <w:r>
-        <w:t xml:space="preserve">3.6 Grievances — lifecycle and conversation</w:t>
+        <w:t xml:space="preserve">3.6 Cases — lifecycle, actions and communication</w:t>
       </w:r>
     </w:p>
     <w:tbl>
@@ -4137,29 +3871,29 @@
               <w:pStyle w:val="Compact"/>
             </w:pPr>
             <w:r>
-              <w:t xml:space="preserve">/api/v1/grievances/{ticket_number}/confirm</w:t>
-            </w:r>
-          </w:p>
-        </w:tc>
-        <w:tc>
-          <w:tcPr/>
-          <w:p>
-            <w:pPr>
-              <w:pStyle w:val="Compact"/>
-            </w:pPr>
-            <w:r>
-              <w:t xml:space="preserve">Submitter confirms the resolution (optional rating)</w:t>
-            </w:r>
-          </w:p>
-        </w:tc>
-        <w:tc>
-          <w:tcPr/>
-          <w:p>
-            <w:pPr>
-              <w:pStyle w:val="Compact"/>
-            </w:pPr>
-            <w:r>
-              <w:t xml:space="preserve">Owning submitter</w:t>
+              <w:t xml:space="preserve">/api/v1/cases/{ticket_number}/action</w:t>
+            </w:r>
+          </w:p>
+        </w:tc>
+        <w:tc>
+          <w:tcPr/>
+          <w:p>
+            <w:pPr>
+              <w:pStyle w:val="Compact"/>
+            </w:pPr>
+            <w:r>
+              <w:t xml:space="preserve">Unified workflow action endpoint: execute state transitions (Verify, Confirm, Reopen, Reject, Escalate, Assign) with reason, remarks, and optional rating</w:t>
+            </w:r>
+          </w:p>
+        </w:tc>
+        <w:tc>
+          <w:tcPr/>
+          <w:p>
+            <w:pPr>
+              <w:pStyle w:val="Compact"/>
+            </w:pPr>
+            <w:r>
+              <w:t xml:space="preserve">Owner, assigned officer or admin</w:t>
             </w:r>
           </w:p>
         </w:tc>
@@ -4183,259 +3917,29 @@
               <w:pStyle w:val="Compact"/>
             </w:pPr>
             <w:r>
-              <w:t xml:space="preserve">/api/v1/grievances/{ticket_number}/reopen</w:t>
-            </w:r>
-          </w:p>
-        </w:tc>
-        <w:tc>
-          <w:tcPr/>
-          <w:p>
-            <w:pPr>
-              <w:pStyle w:val="Compact"/>
-            </w:pPr>
-            <w:r>
-              <w:t xml:space="preserve">Reopen a resolved case, reason mandatory</w:t>
-            </w:r>
-          </w:p>
-        </w:tc>
-        <w:tc>
-          <w:tcPr/>
-          <w:p>
-            <w:pPr>
-              <w:pStyle w:val="Compact"/>
-            </w:pPr>
-            <w:r>
-              <w:t xml:space="preserve">Owning submitter</w:t>
-            </w:r>
-          </w:p>
-        </w:tc>
-      </w:tr>
-      <w:tr>
-        <w:tc>
-          <w:tcPr/>
-          <w:p>
-            <w:pPr>
-              <w:pStyle w:val="Compact"/>
-            </w:pPr>
-            <w:r>
-              <w:t xml:space="preserve">POST</w:t>
-            </w:r>
-          </w:p>
-        </w:tc>
-        <w:tc>
-          <w:tcPr/>
-          <w:p>
-            <w:pPr>
-              <w:pStyle w:val="Compact"/>
-            </w:pPr>
-            <w:r>
-              <w:t xml:space="preserve">/api/v1/grievances/{ticket_number}/reject</w:t>
-            </w:r>
-          </w:p>
-        </w:tc>
-        <w:tc>
-          <w:tcPr/>
-          <w:p>
-            <w:pPr>
-              <w:pStyle w:val="Compact"/>
-            </w:pPr>
-            <w:r>
-              <w:t xml:space="preserve">Reject a case with a reason</w:t>
-            </w:r>
-          </w:p>
-        </w:tc>
-        <w:tc>
-          <w:tcPr/>
-          <w:p>
-            <w:pPr>
-              <w:pStyle w:val="Compact"/>
-            </w:pPr>
-            <w:r>
-              <w:t xml:space="preserve">Assigned officer</w:t>
-            </w:r>
-          </w:p>
-        </w:tc>
-      </w:tr>
-      <w:tr>
-        <w:tc>
-          <w:tcPr/>
-          <w:p>
-            <w:pPr>
-              <w:pStyle w:val="Compact"/>
-            </w:pPr>
-            <w:r>
-              <w:t xml:space="preserve">POST</w:t>
-            </w:r>
-          </w:p>
-        </w:tc>
-        <w:tc>
-          <w:tcPr/>
-          <w:p>
-            <w:pPr>
-              <w:pStyle w:val="Compact"/>
-            </w:pPr>
-            <w:r>
-              <w:t xml:space="preserve">/api/v1/grievances/{ticket_number}/escalate</w:t>
-            </w:r>
-          </w:p>
-        </w:tc>
-        <w:tc>
-          <w:tcPr/>
-          <w:p>
-            <w:pPr>
-              <w:pStyle w:val="Compact"/>
-            </w:pPr>
-            <w:r>
-              <w:t xml:space="preserve">Escalate a case once its SLA has passed. An officer or admin gives a reason; a submitter does not need one</w:t>
-            </w:r>
-          </w:p>
-        </w:tc>
-        <w:tc>
-          <w:tcPr/>
-          <w:p>
-            <w:pPr>
-              <w:pStyle w:val="Compact"/>
-            </w:pPr>
-            <w:r>
-              <w:t xml:space="preserve">Owning submitter, officer or admin</w:t>
-            </w:r>
-          </w:p>
-        </w:tc>
-      </w:tr>
-      <w:tr>
-        <w:tc>
-          <w:tcPr/>
-          <w:p>
-            <w:pPr>
-              <w:pStyle w:val="Compact"/>
-            </w:pPr>
-            <w:r>
-              <w:t xml:space="preserve">POST</w:t>
-            </w:r>
-          </w:p>
-        </w:tc>
-        <w:tc>
-          <w:tcPr/>
-          <w:p>
-            <w:pPr>
-              <w:pStyle w:val="Compact"/>
-            </w:pPr>
-            <w:r>
-              <w:t xml:space="preserve">/api/v1/grievances/{ticket_number}/reply</w:t>
-            </w:r>
-          </w:p>
-        </w:tc>
-        <w:tc>
-          <w:tcPr/>
-          <w:p>
-            <w:pPr>
-              <w:pStyle w:val="Compact"/>
-            </w:pPr>
-            <w:r>
-              <w:t xml:space="preserve">Reply to a More Info Needed request</w:t>
-            </w:r>
-          </w:p>
-        </w:tc>
-        <w:tc>
-          <w:tcPr/>
-          <w:p>
-            <w:pPr>
-              <w:pStyle w:val="Compact"/>
-            </w:pPr>
-            <w:r>
-              <w:t xml:space="preserve">Owning submitter</w:t>
-            </w:r>
-          </w:p>
-        </w:tc>
-      </w:tr>
-      <w:tr>
-        <w:tc>
-          <w:tcPr/>
-          <w:p>
-            <w:pPr>
-              <w:pStyle w:val="Compact"/>
-            </w:pPr>
-            <w:r>
-              <w:t xml:space="preserve">POST</w:t>
-            </w:r>
-          </w:p>
-        </w:tc>
-        <w:tc>
-          <w:tcPr/>
-          <w:p>
-            <w:pPr>
-              <w:pStyle w:val="Compact"/>
-            </w:pPr>
-            <w:r>
-              <w:t xml:space="preserve">/api/v1/grievances/{ticket_number}/message</w:t>
-            </w:r>
-          </w:p>
-        </w:tc>
-        <w:tc>
-          <w:tcPr/>
-          <w:p>
-            <w:pPr>
-              <w:pStyle w:val="Compact"/>
-            </w:pPr>
-            <w:r>
-              <w:t xml:space="preserve">Post a public message to the conversation</w:t>
-            </w:r>
-          </w:p>
-        </w:tc>
-        <w:tc>
-          <w:tcPr/>
-          <w:p>
-            <w:pPr>
-              <w:pStyle w:val="Compact"/>
-            </w:pPr>
-            <w:r>
-              <w:t xml:space="preserve">Owner or assigned officer</w:t>
-            </w:r>
-          </w:p>
-        </w:tc>
-      </w:tr>
-      <w:tr>
-        <w:tc>
-          <w:tcPr/>
-          <w:p>
-            <w:pPr>
-              <w:pStyle w:val="Compact"/>
-            </w:pPr>
-            <w:r>
-              <w:t xml:space="preserve">POST</w:t>
-            </w:r>
-          </w:p>
-        </w:tc>
-        <w:tc>
-          <w:tcPr/>
-          <w:p>
-            <w:pPr>
-              <w:pStyle w:val="Compact"/>
-            </w:pPr>
-            <w:r>
-              <w:t xml:space="preserve">/api/v1/grievances/{ticket_number}/note</w:t>
-            </w:r>
-          </w:p>
-        </w:tc>
-        <w:tc>
-          <w:tcPr/>
-          <w:p>
-            <w:pPr>
-              <w:pStyle w:val="Compact"/>
-            </w:pPr>
-            <w:r>
-              <w:t xml:space="preserve">Add an internal or public note</w:t>
-            </w:r>
-          </w:p>
-        </w:tc>
-        <w:tc>
-          <w:tcPr/>
-          <w:p>
-            <w:pPr>
-              <w:pStyle w:val="Compact"/>
-            </w:pPr>
-            <w:r>
-              <w:t xml:space="preserve">Staff only</w:t>
+              <w:t xml:space="preserve">/api/v1/cases/{ticket_number}/message</w:t>
+            </w:r>
+          </w:p>
+        </w:tc>
+        <w:tc>
+          <w:tcPr/>
+          <w:p>
+            <w:pPr>
+              <w:pStyle w:val="Compact"/>
+            </w:pPr>
+            <w:r>
+              <w:t xml:space="preserve">Unified communication &amp; response: post public messages, internal notes, info requests, submitter replies, or structured department responses driving workflow status</w:t>
+            </w:r>
+          </w:p>
+        </w:tc>
+        <w:tc>
+          <w:tcPr/>
+          <w:p>
+            <w:pPr>
+              <w:pStyle w:val="Compact"/>
+            </w:pPr>
+            <w:r>
+              <w:t xml:space="preserve">Owner or assigned officer (staff only for notes)</w:t>
             </w:r>
           </w:p>
         </w:tc>
@@ -4459,18 +3963,18 @@
               <w:pStyle w:val="Compact"/>
             </w:pPr>
             <w:r>
-              <w:t xml:space="preserve">/api/v1/grievances/{ticket_number}/timeline</w:t>
-            </w:r>
-          </w:p>
-        </w:tc>
-        <w:tc>
-          <w:tcPr/>
-          <w:p>
-            <w:pPr>
-              <w:pStyle w:val="Compact"/>
-            </w:pPr>
-            <w:r>
-              <w:t xml:space="preserve">Timeline and thread detail, visibility-filtered</w:t>
+              <w:t xml:space="preserve">/api/v1/cases/{ticket_number}/timeline</w:t>
+            </w:r>
+          </w:p>
+        </w:tc>
+        <w:tc>
+          <w:tcPr/>
+          <w:p>
+            <w:pPr>
+              <w:pStyle w:val="Compact"/>
+            </w:pPr>
+            <w:r>
+              <w:t xml:space="preserve">Timeline and conversation thread detail, visibility-filtered</w:t>
             </w:r>
           </w:p>
         </w:tc>
@@ -4578,7 +4082,7 @@
               <w:pStyle w:val="Compact"/>
             </w:pPr>
             <w:r>
-              <w:t xml:space="preserve">/api/v1/grievances/{grievance}/attachments</w:t>
+              <w:t xml:space="preserve">/api/v1/cases/{ticket_number}/attachments</w:t>
             </w:r>
           </w:p>
         </w:tc>
@@ -4624,7 +4128,7 @@
               <w:pStyle w:val="Compact"/>
             </w:pPr>
             <w:r>
-              <w:t xml:space="preserve">/api/v1/grievances/{grievance}/attachments</w:t>
+              <w:t xml:space="preserve">/api/v1/cases/{ticket_number}/attachments</w:t>
             </w:r>
           </w:p>
         </w:tc>
@@ -4670,7 +4174,7 @@
               <w:pStyle w:val="Compact"/>
             </w:pPr>
             <w:r>
-              <w:t xml:space="preserve">/api/v1/attachments/{attachment}/download</w:t>
+              <w:t xml:space="preserve">/api/v1/cases/{ticket_number}/attachments/{attachment_id}/download</w:t>
             </w:r>
           </w:p>
         </w:tc>
@@ -4716,7 +4220,7 @@
               <w:pStyle w:val="Compact"/>
             </w:pPr>
             <w:r>
-              <w:t xml:space="preserve">/api/v1/attachments/{attachment}</w:t>
+              <w:t xml:space="preserve">/api/v1/cases/{ticket_number}/attachments/{attachment_id}</w:t>
             </w:r>
           </w:p>
         </w:tc>
@@ -4938,7 +4442,7 @@
               <w:pStyle w:val="Compact"/>
             </w:pPr>
             <w:r>
-              <w:t xml:space="preserve">/api/v1/admin/officers</w:t>
+              <w:t xml:space="preserve">/api/v1/users/officers</w:t>
             </w:r>
           </w:p>
         </w:tc>
@@ -4984,7 +4488,7 @@
               <w:pStyle w:val="Compact"/>
             </w:pPr>
             <w:r>
-              <w:t xml:space="preserve">/api/v1/admin/officers</w:t>
+              <w:t xml:space="preserve">/api/v1/users/officers</w:t>
             </w:r>
           </w:p>
         </w:tc>
@@ -5030,7 +4534,7 @@
               <w:pStyle w:val="Compact"/>
             </w:pPr>
             <w:r>
-              <w:t xml:space="preserve">/api/v1/admin/officers/{officer}</w:t>
+              <w:t xml:space="preserve">/api/v1/users/officers/{officer}</w:t>
             </w:r>
           </w:p>
         </w:tc>
@@ -5076,7 +4580,7 @@
               <w:pStyle w:val="Compact"/>
             </w:pPr>
             <w:r>
-              <w:t xml:space="preserve">/api/v1/admin/officers/{officer}</w:t>
+              <w:t xml:space="preserve">/api/v1/users/officers/{officer}</w:t>
             </w:r>
           </w:p>
         </w:tc>
@@ -5122,7 +4626,7 @@
               <w:pStyle w:val="Compact"/>
             </w:pPr>
             <w:r>
-              <w:t xml:space="preserve">/api/v1/admin/officers/{officer}/reset-password</w:t>
+              <w:t xml:space="preserve">/api/v1/users/officers/{officer}/reset-password</w:t>
             </w:r>
           </w:p>
         </w:tc>
@@ -5168,7 +4672,7 @@
               <w:pStyle w:val="Compact"/>
             </w:pPr>
             <w:r>
-              <w:t xml:space="preserve">/api/v1/admin/users</w:t>
+              <w:t xml:space="preserve">/api/v1/users</w:t>
             </w:r>
           </w:p>
         </w:tc>
@@ -5229,7 +4733,7 @@
               <w:pStyle w:val="Compact"/>
             </w:pPr>
             <w:r>
-              <w:t xml:space="preserve">/api/v1/admin/users/summary</w:t>
+              <w:t xml:space="preserve">/api/v1/users/summary</w:t>
             </w:r>
           </w:p>
         </w:tc>
@@ -5241,6 +4745,52 @@
             </w:pPr>
             <w:r>
               <w:t xml:space="preserve">Counts for the User Management KPI cards: total, active, inactive, and the split by role level, within the caller’s scope</w:t>
+            </w:r>
+          </w:p>
+        </w:tc>
+        <w:tc>
+          <w:tcPr/>
+          <w:p>
+            <w:pPr>
+              <w:pStyle w:val="Compact"/>
+            </w:pPr>
+            <w:r>
+              <w:t xml:space="preserve">Admin or department head</w:t>
+            </w:r>
+          </w:p>
+        </w:tc>
+      </w:tr>
+      <w:tr>
+        <w:tc>
+          <w:tcPr/>
+          <w:p>
+            <w:pPr>
+              <w:pStyle w:val="Compact"/>
+            </w:pPr>
+            <w:r>
+              <w:t xml:space="preserve">GET</w:t>
+            </w:r>
+          </w:p>
+        </w:tc>
+        <w:tc>
+          <w:tcPr/>
+          <w:p>
+            <w:pPr>
+              <w:pStyle w:val="Compact"/>
+            </w:pPr>
+            <w:r>
+              <w:t xml:space="preserve">/api/v1/users/options</w:t>
+            </w:r>
+          </w:p>
+        </w:tc>
+        <w:tc>
+          <w:tcPr/>
+          <w:p>
+            <w:pPr>
+              <w:pStyle w:val="Compact"/>
+            </w:pPr>
+            <w:r>
+              <w:t xml:space="preserve">Dropdown options and reference data for user &amp; officer creation (roles, departments, role levels, administrative areas)</w:t>
             </w:r>
           </w:p>
         </w:tc>
@@ -5348,7 +4898,7 @@
               <w:pStyle w:val="Compact"/>
             </w:pPr>
             <w:r>
-              <w:t xml:space="preserve">/api/v1/admin/departments</w:t>
+              <w:t xml:space="preserve">/api/v1/departments</w:t>
             </w:r>
           </w:p>
         </w:tc>
@@ -5394,7 +4944,7 @@
               <w:pStyle w:val="Compact"/>
             </w:pPr>
             <w:r>
-              <w:t xml:space="preserve">/api/v1/admin/departments</w:t>
+              <w:t xml:space="preserve">/api/v1/departments</w:t>
             </w:r>
           </w:p>
         </w:tc>
@@ -5440,7 +4990,7 @@
               <w:pStyle w:val="Compact"/>
             </w:pPr>
             <w:r>
-              <w:t xml:space="preserve">/api/v1/admin/departments/{department}</w:t>
+              <w:t xml:space="preserve">/api/v1/departments/{department}</w:t>
             </w:r>
           </w:p>
         </w:tc>
@@ -5486,7 +5036,7 @@
               <w:pStyle w:val="Compact"/>
             </w:pPr>
             <w:r>
-              <w:t xml:space="preserve">/api/v1/admin/departments/{department}</w:t>
+              <w:t xml:space="preserve">/api/v1/departments/{department}</w:t>
             </w:r>
           </w:p>
         </w:tc>
@@ -5532,7 +5082,7 @@
               <w:pStyle w:val="Compact"/>
             </w:pPr>
             <w:r>
-              <w:t xml:space="preserve">/api/v1/admin/departments/{department}</w:t>
+              <w:t xml:space="preserve">/api/v1/departments/{department}</w:t>
             </w:r>
           </w:p>
         </w:tc>
@@ -5659,7 +5209,7 @@
               <w:pStyle w:val="Compact"/>
             </w:pPr>
             <w:r>
-              <w:t xml:space="preserve">/api/v1/admin/service-categories</w:t>
+              <w:t xml:space="preserve">/api/v1/service-categories</w:t>
             </w:r>
           </w:p>
         </w:tc>
@@ -5705,7 +5255,7 @@
               <w:pStyle w:val="Compact"/>
             </w:pPr>
             <w:r>
-              <w:t xml:space="preserve">/api/v1/admin/service-categories</w:t>
+              <w:t xml:space="preserve">/api/v1/service-categories</w:t>
             </w:r>
           </w:p>
         </w:tc>
@@ -5751,7 +5301,7 @@
               <w:pStyle w:val="Compact"/>
             </w:pPr>
             <w:r>
-              <w:t xml:space="preserve">/api/v1/admin/service-categories/{category}</w:t>
+              <w:t xml:space="preserve">/api/v1/service-categories/{category}</w:t>
             </w:r>
           </w:p>
         </w:tc>
@@ -5797,7 +5347,7 @@
               <w:pStyle w:val="Compact"/>
             </w:pPr>
             <w:r>
-              <w:t xml:space="preserve">/api/v1/admin/grievance-types</w:t>
+              <w:t xml:space="preserve">/api/v1/grievance-types</w:t>
             </w:r>
           </w:p>
         </w:tc>
@@ -5843,7 +5393,7 @@
               <w:pStyle w:val="Compact"/>
             </w:pPr>
             <w:r>
-              <w:t xml:space="preserve">/api/v1/admin/grievance-types</w:t>
+              <w:t xml:space="preserve">/api/v1/grievance-types</w:t>
             </w:r>
           </w:p>
         </w:tc>
@@ -5889,7 +5439,7 @@
               <w:pStyle w:val="Compact"/>
             </w:pPr>
             <w:r>
-              <w:t xml:space="preserve">/api/v1/admin/grievance-types/{type}</w:t>
+              <w:t xml:space="preserve">/api/v1/grievance-types/{type}</w:t>
             </w:r>
           </w:p>
         </w:tc>
@@ -5924,7 +5474,7 @@
         <w:pStyle w:val="Heading3"/>
       </w:pPr>
       <w:r>
-        <w:t xml:space="preserve">Routing rules and SLA policy</w:t>
+        <w:t xml:space="preserve">RBAC assignment rules and SLA policy</w:t>
       </w:r>
     </w:p>
     <w:tbl>
@@ -6008,18 +5558,18 @@
               <w:pStyle w:val="Compact"/>
             </w:pPr>
             <w:r>
-              <w:t xml:space="preserve">/api/v1/admin/routing-rules</w:t>
-            </w:r>
-          </w:p>
-        </w:tc>
-        <w:tc>
-          <w:tcPr/>
-          <w:p>
-            <w:pPr>
-              <w:pStyle w:val="Compact"/>
-            </w:pPr>
-            <w:r>
-              <w:t xml:space="preserve">Link category and administrative area to an owning department, with a precedence</w:t>
+              <w:t xml:space="preserve">/api/v1/rbac-assignments</w:t>
+            </w:r>
+          </w:p>
+        </w:tc>
+        <w:tc>
+          <w:tcPr/>
+          <w:p>
+            <w:pPr>
+              <w:pStyle w:val="Compact"/>
+            </w:pPr>
+            <w:r>
+              <w:t xml:space="preserve">Link category, type, provider, and administrative area to an owning department and officer roster</w:t>
             </w:r>
           </w:p>
         </w:tc>
@@ -6054,18 +5604,18 @@
               <w:pStyle w:val="Compact"/>
             </w:pPr>
             <w:r>
-              <w:t xml:space="preserve">/api/v1/admin/routing-rules</w:t>
-            </w:r>
-          </w:p>
-        </w:tc>
-        <w:tc>
-          <w:tcPr/>
-          <w:p>
-            <w:pPr>
-              <w:pStyle w:val="Compact"/>
-            </w:pPr>
-            <w:r>
-              <w:t xml:space="preserve">List rules in precedence order</w:t>
+              <w:t xml:space="preserve">/api/v1/rbac-assignments</w:t>
+            </w:r>
+          </w:p>
+        </w:tc>
+        <w:tc>
+          <w:tcPr/>
+          <w:p>
+            <w:pPr>
+              <w:pStyle w:val="Compact"/>
+            </w:pPr>
+            <w:r>
+              <w:t xml:space="preserve">List RBAC assignment desks and routing scopes</w:t>
             </w:r>
           </w:p>
         </w:tc>
@@ -6100,18 +5650,18 @@
               <w:pStyle w:val="Compact"/>
             </w:pPr>
             <w:r>
-              <w:t xml:space="preserve">/api/v1/admin/routing-rules/{rule}</w:t>
-            </w:r>
-          </w:p>
-        </w:tc>
-        <w:tc>
-          <w:tcPr/>
-          <w:p>
-            <w:pPr>
-              <w:pStyle w:val="Compact"/>
-            </w:pPr>
-            <w:r>
-              <w:t xml:space="preserve">Change target department, precedence or active flag</w:t>
+              <w:t xml:space="preserve">/api/v1/rbac-assignments/{assignment}</w:t>
+            </w:r>
+          </w:p>
+        </w:tc>
+        <w:tc>
+          <w:tcPr/>
+          <w:p>
+            <w:pPr>
+              <w:pStyle w:val="Compact"/>
+            </w:pPr>
+            <w:r>
+              <w:t xml:space="preserve">Change target department, scopes, officer roster, or active flag</w:t>
             </w:r>
           </w:p>
         </w:tc>
@@ -6146,18 +5696,18 @@
               <w:pStyle w:val="Compact"/>
             </w:pPr>
             <w:r>
-              <w:t xml:space="preserve">/api/v1/admin/routing-rules/{rule}</w:t>
-            </w:r>
-          </w:p>
-        </w:tc>
-        <w:tc>
-          <w:tcPr/>
-          <w:p>
-            <w:pPr>
-              <w:pStyle w:val="Compact"/>
-            </w:pPr>
-            <w:r>
-              <w:t xml:space="preserve">Remove a rule</w:t>
+              <w:t xml:space="preserve">/api/v1/rbac-assignments/{assignment}</w:t>
+            </w:r>
+          </w:p>
+        </w:tc>
+        <w:tc>
+          <w:tcPr/>
+          <w:p>
+            <w:pPr>
+              <w:pStyle w:val="Compact"/>
+            </w:pPr>
+            <w:r>
+              <w:t xml:space="preserve">Remove an assignment desk</w:t>
             </w:r>
           </w:p>
         </w:tc>
@@ -6192,7 +5742,7 @@
               <w:pStyle w:val="Compact"/>
             </w:pPr>
             <w:r>
-              <w:t xml:space="preserve">/api/v1/admin/service-categories/{category}/reassignment-approval</w:t>
+              <w:t xml:space="preserve">/api/v1/service-categories/{category}/reassignment-approval</w:t>
             </w:r>
           </w:p>
         </w:tc>
@@ -6238,7 +5788,7 @@
               <w:pStyle w:val="Compact"/>
             </w:pPr>
             <w:r>
-              <w:t xml:space="preserve">/api/v1/admin/sla-configurations</w:t>
+              <w:t xml:space="preserve">/api/v1/sla-configurations</w:t>
             </w:r>
           </w:p>
         </w:tc>
@@ -6284,7 +5834,7 @@
               <w:pStyle w:val="Compact"/>
             </w:pPr>
             <w:r>
-              <w:t xml:space="preserve">/api/v1/admin/sla-configurations</w:t>
+              <w:t xml:space="preserve">/api/v1/sla-configurations</w:t>
             </w:r>
           </w:p>
         </w:tc>
@@ -6330,7 +5880,7 @@
               <w:pStyle w:val="Compact"/>
             </w:pPr>
             <w:r>
-              <w:t xml:space="preserve">/api/v1/admin/sla-configurations/{config}</w:t>
+              <w:t xml:space="preserve">/api/v1/sla-configurations/{config}</w:t>
             </w:r>
           </w:p>
         </w:tc>
@@ -6509,7 +6059,7 @@
               <w:pStyle w:val="Compact"/>
             </w:pPr>
             <w:r>
-              <w:t xml:space="preserve">/api/v1/admin/response-templates</w:t>
+              <w:t xml:space="preserve">/api/v1/response-templates</w:t>
             </w:r>
           </w:p>
         </w:tc>
@@ -6555,7 +6105,7 @@
               <w:pStyle w:val="Compact"/>
             </w:pPr>
             <w:r>
-              <w:t xml:space="preserve">/api/v1/admin/response-templates</w:t>
+              <w:t xml:space="preserve">/api/v1/response-templates</w:t>
             </w:r>
           </w:p>
         </w:tc>
@@ -6637,7 +6187,7 @@
               <w:pStyle w:val="Compact"/>
             </w:pPr>
             <w:r>
-              <w:t xml:space="preserve">/api/v1/admin/response-templates/{template}</w:t>
+              <w:t xml:space="preserve">/api/v1/response-templates/{template}</w:t>
             </w:r>
           </w:p>
         </w:tc>
@@ -6683,7 +6233,7 @@
               <w:pStyle w:val="Compact"/>
             </w:pPr>
             <w:r>
-              <w:t xml:space="preserve">/api/v1/admin/response-templates/{template}</w:t>
+              <w:t xml:space="preserve">/api/v1/response-templates/{template}</w:t>
             </w:r>
           </w:p>
         </w:tc>
@@ -6729,7 +6279,7 @@
               <w:pStyle w:val="Compact"/>
             </w:pPr>
             <w:r>
-              <w:t xml:space="preserve">/api/v1/admin/response-templates/{template}</w:t>
+              <w:t xml:space="preserve">/api/v1/response-templates/{template}</w:t>
             </w:r>
           </w:p>
         </w:tc>
@@ -6775,7 +6325,7 @@
               <w:pStyle w:val="Compact"/>
             </w:pPr>
             <w:r>
-              <w:t xml:space="preserve">/api/v1/grievances/{ticket_number}/response-templates</w:t>
+              <w:t xml:space="preserve">/api/v1/cases/{ticket_number}/response-templates</w:t>
             </w:r>
           </w:p>
         </w:tc>
@@ -6929,7 +6479,7 @@
               <w:pStyle w:val="Compact"/>
             </w:pPr>
             <w:r>
-              <w:t xml:space="preserve">/api/v1/admin/notification-configs</w:t>
+              <w:t xml:space="preserve">/api/v1/notification-configs</w:t>
             </w:r>
           </w:p>
         </w:tc>
@@ -6975,7 +6525,7 @@
               <w:pStyle w:val="Compact"/>
             </w:pPr>
             <w:r>
-              <w:t xml:space="preserve">/api/v1/admin/notification-configs/{event}</w:t>
+              <w:t xml:space="preserve">/api/v1/notification-configs/{event}</w:t>
             </w:r>
           </w:p>
         </w:tc>
@@ -7021,7 +6571,7 @@
               <w:pStyle w:val="Compact"/>
             </w:pPr>
             <w:r>
-              <w:t xml:space="preserve">/api/v1/admin/notification-configs/{event}</w:t>
+              <w:t xml:space="preserve">/api/v1/notification-configs/{event}</w:t>
             </w:r>
           </w:p>
         </w:tc>
@@ -7067,7 +6617,7 @@
               <w:pStyle w:val="Compact"/>
             </w:pPr>
             <w:r>
-              <w:t xml:space="preserve">/api/v1/admin/notification-configs/{event}/preview</w:t>
+              <w:t xml:space="preserve">/api/v1/notification-configs/{event}/preview</w:t>
             </w:r>
           </w:p>
         </w:tc>
@@ -7102,7 +6652,7 @@
         <w:pStyle w:val="Heading2"/>
       </w:pPr>
       <w:r>
-        <w:t xml:space="preserve">3.11 Dashboard, metrics and analytics</w:t>
+        <w:t xml:space="preserve">3.11 Reports &amp; analytics</w:t>
       </w:r>
     </w:p>
     <w:p>
@@ -7248,18 +6798,18 @@
               <w:pStyle w:val="Compact"/>
             </w:pPr>
             <w:r>
-              <w:t xml:space="preserve">/api/v1/dashboard/summary</w:t>
-            </w:r>
-          </w:p>
-        </w:tc>
-        <w:tc>
-          <w:tcPr/>
-          <w:p>
-            <w:pPr>
-              <w:pStyle w:val="Compact"/>
-            </w:pPr>
-            <w:r>
-              <w:t xml:space="preserve">KPI tiles with period-over-period trend, scoped to the caller’s department and area</w:t>
+              <w:t xml:space="preserve">/api/v1/cases/summary</w:t>
+            </w:r>
+          </w:p>
+        </w:tc>
+        <w:tc>
+          <w:tcPr/>
+          <w:p>
+            <w:pPr>
+              <w:pStyle w:val="Compact"/>
+            </w:pPr>
+            <w:r>
+              <w:t xml:space="preserve">KPI summary tiles and status counts with period-over-period trend, scoped to the caller’s department and area</w:t>
             </w:r>
           </w:p>
         </w:tc>
@@ -7294,18 +6844,18 @@
               <w:pStyle w:val="Compact"/>
             </w:pPr>
             <w:r>
-              <w:t xml:space="preserve">/api/v1/dashboard/trend</w:t>
-            </w:r>
-          </w:p>
-        </w:tc>
-        <w:tc>
-          <w:tcPr/>
-          <w:p>
-            <w:pPr>
-              <w:pStyle w:val="Compact"/>
-            </w:pPr>
-            <w:r>
-              <w:t xml:space="preserve">Submitted vs resolved per month over a window</w:t>
+              <w:t xml:space="preserve">/api/v1/reports/trend</w:t>
+            </w:r>
+          </w:p>
+        </w:tc>
+        <w:tc>
+          <w:tcPr/>
+          <w:p>
+            <w:pPr>
+              <w:pStyle w:val="Compact"/>
+            </w:pPr>
+            <w:r>
+              <w:t xml:space="preserve">Submitted vs resolved per month/week over a window</w:t>
             </w:r>
           </w:p>
         </w:tc>
@@ -7340,18 +6890,18 @@
               <w:pStyle w:val="Compact"/>
             </w:pPr>
             <w:r>
-              <w:t xml:space="preserve">/api/v1/dashboard/status-distribution</w:t>
-            </w:r>
-          </w:p>
-        </w:tc>
-        <w:tc>
-          <w:tcPr/>
-          <w:p>
-            <w:pPr>
-              <w:pStyle w:val="Compact"/>
-            </w:pPr>
-            <w:r>
-              <w:t xml:space="preserve">Case counts per lifecycle status</w:t>
+              <w:t xml:space="preserve">/api/v1/reports/status-distribution</w:t>
+            </w:r>
+          </w:p>
+        </w:tc>
+        <w:tc>
+          <w:tcPr/>
+          <w:p>
+            <w:pPr>
+              <w:pStyle w:val="Compact"/>
+            </w:pPr>
+            <w:r>
+              <w:t xml:space="preserve">Case distribution per lifecycle status</w:t>
             </w:r>
           </w:p>
         </w:tc>
@@ -7386,18 +6936,18 @@
               <w:pStyle w:val="Compact"/>
             </w:pPr>
             <w:r>
-              <w:t xml:space="preserve">/api/v1/dashboard/category-distribution</w:t>
-            </w:r>
-          </w:p>
-        </w:tc>
-        <w:tc>
-          <w:tcPr/>
-          <w:p>
-            <w:pPr>
-              <w:pStyle w:val="Compact"/>
-            </w:pPr>
-            <w:r>
-              <w:t xml:space="preserve">Case counts per service category</w:t>
+              <w:t xml:space="preserve">/api/v1/reports/category-distribution</w:t>
+            </w:r>
+          </w:p>
+        </w:tc>
+        <w:tc>
+          <w:tcPr/>
+          <w:p>
+            <w:pPr>
+              <w:pStyle w:val="Compact"/>
+            </w:pPr>
+            <w:r>
+              <w:t xml:space="preserve">Case distribution per service category</w:t>
             </w:r>
           </w:p>
         </w:tc>
@@ -7432,38 +6982,29 @@
               <w:pStyle w:val="Compact"/>
             </w:pPr>
             <w:r>
-              <w:t xml:space="preserve">/api/v1/grievances/counts</w:t>
-            </w:r>
-          </w:p>
-        </w:tc>
-        <w:tc>
-          <w:tcPr/>
-          <w:p>
-            <w:pPr>
-              <w:pStyle w:val="Compact"/>
-            </w:pPr>
-            <w:r>
-              <w:t xml:space="preserve">Counts per status bucket for the case-list metric cards, over the whole filtered set rather than the loaded page; takes the same filter parameters as</w:t>
-            </w:r>
-            <w:r>
-              <w:t xml:space="preserve"> </w:t>
-            </w:r>
-            <w:r>
-              <w:rPr>
-                <w:rStyle w:val="VerbatimChar"/>
-              </w:rPr>
-              <w:t xml:space="preserve">GET /api/v1/grievances</w:t>
-            </w:r>
-          </w:p>
-        </w:tc>
-        <w:tc>
-          <w:tcPr/>
-          <w:p>
-            <w:pPr>
-              <w:pStyle w:val="Compact"/>
-            </w:pPr>
-            <w:r>
-              <w:t xml:space="preserve">Scoped by role</w:t>
+              <w:t xml:space="preserve">/api/v1/reports/kpis</w:t>
+            </w:r>
+          </w:p>
+        </w:tc>
+        <w:tc>
+          <w:tcPr/>
+          <w:p>
+            <w:pPr>
+              <w:pStyle w:val="Compact"/>
+            </w:pPr>
+            <w:r>
+              <w:t xml:space="preserve">Average resolution time, SLA compliance, escalation rate, and satisfaction against previous period</w:t>
+            </w:r>
+          </w:p>
+        </w:tc>
+        <w:tc>
+          <w:tcPr/>
+          <w:p>
+            <w:pPr>
+              <w:pStyle w:val="Compact"/>
+            </w:pPr>
+            <w:r>
+              <w:t xml:space="preserve">Staff</w:t>
             </w:r>
           </w:p>
         </w:tc>
@@ -7487,18 +7028,18 @@
               <w:pStyle w:val="Compact"/>
             </w:pPr>
             <w:r>
-              <w:t xml:space="preserve">/api/v1/analytics/kpis</w:t>
-            </w:r>
-          </w:p>
-        </w:tc>
-        <w:tc>
-          <w:tcPr/>
-          <w:p>
-            <w:pPr>
-              <w:pStyle w:val="Compact"/>
-            </w:pPr>
-            <w:r>
-              <w:t xml:space="preserve">Average resolution time, resolution rate, escalation rate and satisfaction, each against the previous period</w:t>
+              <w:t xml:space="preserve">/api/v1/reports/submissions</w:t>
+            </w:r>
+          </w:p>
+        </w:tc>
+        <w:tc>
+          <w:tcPr/>
+          <w:p>
+            <w:pPr>
+              <w:pStyle w:val="Compact"/>
+            </w:pPr>
+            <w:r>
+              <w:t xml:space="preserve">Submission volume by intake channel and week</w:t>
             </w:r>
           </w:p>
         </w:tc>
@@ -7533,18 +7074,18 @@
               <w:pStyle w:val="Compact"/>
             </w:pPr>
             <w:r>
-              <w:t xml:space="preserve">/api/v1/analytics/submissions</w:t>
-            </w:r>
-          </w:p>
-        </w:tc>
-        <w:tc>
-          <w:tcPr/>
-          <w:p>
-            <w:pPr>
-              <w:pStyle w:val="Compact"/>
-            </w:pPr>
-            <w:r>
-              <w:t xml:space="preserve">Submission volume by week</w:t>
+              <w:t xml:space="preserve">/api/v1/reports/resolution-by-region</w:t>
+            </w:r>
+          </w:p>
+        </w:tc>
+        <w:tc>
+          <w:tcPr/>
+          <w:p>
+            <w:pPr>
+              <w:pStyle w:val="Compact"/>
+            </w:pPr>
+            <w:r>
+              <w:t xml:space="preserve">Resolution rate per administrative area</w:t>
             </w:r>
           </w:p>
         </w:tc>
@@ -7579,18 +7120,18 @@
               <w:pStyle w:val="Compact"/>
             </w:pPr>
             <w:r>
-              <w:t xml:space="preserve">/api/v1/analytics/resolution-by-region</w:t>
-            </w:r>
-          </w:p>
-        </w:tc>
-        <w:tc>
-          <w:tcPr/>
-          <w:p>
-            <w:pPr>
-              <w:pStyle w:val="Compact"/>
-            </w:pPr>
-            <w:r>
-              <w:t xml:space="preserve">Resolution rate per administrative area</w:t>
+              <w:t xml:space="preserve">/api/v1/reports/volume-by-category</w:t>
+            </w:r>
+          </w:p>
+        </w:tc>
+        <w:tc>
+          <w:tcPr/>
+          <w:p>
+            <w:pPr>
+              <w:pStyle w:val="Compact"/>
+            </w:pPr>
+            <w:r>
+              <w:t xml:space="preserve">Case volume per service category and department</w:t>
             </w:r>
           </w:p>
         </w:tc>
@@ -7614,52 +7155,6 @@
               <w:pStyle w:val="Compact"/>
             </w:pPr>
             <w:r>
-              <w:t xml:space="preserve">GET</w:t>
-            </w:r>
-          </w:p>
-        </w:tc>
-        <w:tc>
-          <w:tcPr/>
-          <w:p>
-            <w:pPr>
-              <w:pStyle w:val="Compact"/>
-            </w:pPr>
-            <w:r>
-              <w:t xml:space="preserve">/api/v1/analytics/volume-by-category</w:t>
-            </w:r>
-          </w:p>
-        </w:tc>
-        <w:tc>
-          <w:tcPr/>
-          <w:p>
-            <w:pPr>
-              <w:pStyle w:val="Compact"/>
-            </w:pPr>
-            <w:r>
-              <w:t xml:space="preserve">Case volume per service category</w:t>
-            </w:r>
-          </w:p>
-        </w:tc>
-        <w:tc>
-          <w:tcPr/>
-          <w:p>
-            <w:pPr>
-              <w:pStyle w:val="Compact"/>
-            </w:pPr>
-            <w:r>
-              <w:t xml:space="preserve">Staff</w:t>
-            </w:r>
-          </w:p>
-        </w:tc>
-      </w:tr>
-      <w:tr>
-        <w:tc>
-          <w:tcPr/>
-          <w:p>
-            <w:pPr>
-              <w:pStyle w:val="Compact"/>
-            </w:pPr>
-            <w:r>
               <w:t xml:space="preserve">POST</w:t>
             </w:r>
           </w:p>
@@ -7671,7 +7166,7 @@
               <w:pStyle w:val="Compact"/>
             </w:pPr>
             <w:r>
-              <w:t xml:space="preserve">/api/v1/analytics/export</w:t>
+              <w:t xml:space="preserve">/api/v1/reports/export</w:t>
             </w:r>
           </w:p>
         </w:tc>
@@ -7714,7 +7209,7 @@
         <w:pStyle w:val="Heading2"/>
       </w:pPr>
       <w:r>
-        <w:t xml:space="preserve">3.12 Case actions</w:t>
+        <w:t xml:space="preserve">3.12 Case triage &amp; SLA operations</w:t>
       </w:r>
     </w:p>
     <w:p>
@@ -7806,29 +7301,29 @@
               <w:pStyle w:val="Compact"/>
             </w:pPr>
             <w:r>
-              <w:t xml:space="preserve">/api/v1/grievances/{ticket_number}/assign</w:t>
-            </w:r>
-          </w:p>
-        </w:tc>
-        <w:tc>
-          <w:tcPr/>
-          <w:p>
-            <w:pPr>
-              <w:pStyle w:val="Compact"/>
-            </w:pPr>
-            <w:r>
-              <w:t xml:space="preserve">Nodal triage: set the owning department and L1 officer on a case that did not match a routing rule (2.3, Phase 2)</w:t>
-            </w:r>
-          </w:p>
-        </w:tc>
-        <w:tc>
-          <w:tcPr/>
-          <w:p>
-            <w:pPr>
-              <w:pStyle w:val="Compact"/>
-            </w:pPr>
-            <w:r>
-              <w:t xml:space="preserve">Nodal officer or admin</w:t>
+              <w:t xml:space="preserve">/api/v1/cases/{ticket_number}/duplicate-decision</w:t>
+            </w:r>
+          </w:p>
+        </w:tc>
+        <w:tc>
+          <w:tcPr/>
+          <w:p>
+            <w:pPr>
+              <w:pStyle w:val="Compact"/>
+            </w:pPr>
+            <w:r>
+              <w:t xml:space="preserve">Confirm or reject the Possible Duplicate flag</w:t>
+            </w:r>
+          </w:p>
+        </w:tc>
+        <w:tc>
+          <w:tcPr/>
+          <w:p>
+            <w:pPr>
+              <w:pStyle w:val="Compact"/>
+            </w:pPr>
+            <w:r>
+              <w:t xml:space="preserve">Assigned officer</w:t>
             </w:r>
           </w:p>
         </w:tc>
@@ -7852,18 +7347,18 @@
               <w:pStyle w:val="Compact"/>
             </w:pPr>
             <w:r>
-              <w:t xml:space="preserve">/api/v1/grievances/{ticket_number}/response</w:t>
-            </w:r>
-          </w:p>
-        </w:tc>
-        <w:tc>
-          <w:tcPr/>
-          <w:p>
-            <w:pPr>
-              <w:pStyle w:val="Compact"/>
-            </w:pPr>
-            <w:r>
-              <w:t xml:space="preserve">File the structured department response — response type, action taken, resolution summary — which is what drives the next status (2.3, Phase 3)</w:t>
+              <w:t xml:space="preserve">/api/v1/cases/{ticket_number}/defer-sla</w:t>
+            </w:r>
+          </w:p>
+        </w:tc>
+        <w:tc>
+          <w:tcPr/>
+          <w:p>
+            <w:pPr>
+              <w:pStyle w:val="Compact"/>
+            </w:pPr>
+            <w:r>
+              <w:t xml:space="preserve">Request an SLA deferral against the deferral policy, with a reason and a new target date</w:t>
             </w:r>
           </w:p>
         </w:tc>
@@ -7898,29 +7393,29 @@
               <w:pStyle w:val="Compact"/>
             </w:pPr>
             <w:r>
-              <w:t xml:space="preserve">/api/v1/grievances/{ticket_number}/duplicate-decision</w:t>
-            </w:r>
-          </w:p>
-        </w:tc>
-        <w:tc>
-          <w:tcPr/>
-          <w:p>
-            <w:pPr>
-              <w:pStyle w:val="Compact"/>
-            </w:pPr>
-            <w:r>
-              <w:t xml:space="preserve">Confirm or reject the Possible Duplicate flag</w:t>
-            </w:r>
-          </w:p>
-        </w:tc>
-        <w:tc>
-          <w:tcPr/>
-          <w:p>
-            <w:pPr>
-              <w:pStyle w:val="Compact"/>
-            </w:pPr>
-            <w:r>
-              <w:t xml:space="preserve">Assigned officer</w:t>
+              <w:t xml:space="preserve">/api/v1/cases/{ticket_number}/reassignment-requests</w:t>
+            </w:r>
+          </w:p>
+        </w:tc>
+        <w:tc>
+          <w:tcPr/>
+          <w:p>
+            <w:pPr>
+              <w:pStyle w:val="Compact"/>
+            </w:pPr>
+            <w:r>
+              <w:t xml:space="preserve">Move the case to another officer or department, reason mandatory. Commits immediately unless the category requires approval, in which case it queues for L2 and the target gains no rights until approved</w:t>
+            </w:r>
+          </w:p>
+        </w:tc>
+        <w:tc>
+          <w:tcPr/>
+          <w:p>
+            <w:pPr>
+              <w:pStyle w:val="Compact"/>
+            </w:pPr>
+            <w:r>
+              <w:t xml:space="preserve">L1 officer</w:t>
             </w:r>
           </w:p>
         </w:tc>
@@ -7944,29 +7439,29 @@
               <w:pStyle w:val="Compact"/>
             </w:pPr>
             <w:r>
-              <w:t xml:space="preserve">/api/v1/grievances/{ticket_number}/defer-sla</w:t>
-            </w:r>
-          </w:p>
-        </w:tc>
-        <w:tc>
-          <w:tcPr/>
-          <w:p>
-            <w:pPr>
-              <w:pStyle w:val="Compact"/>
-            </w:pPr>
-            <w:r>
-              <w:t xml:space="preserve">Request an SLA deferral against the deferral policy, with a reason and a new target date</w:t>
-            </w:r>
-          </w:p>
-        </w:tc>
-        <w:tc>
-          <w:tcPr/>
-          <w:p>
-            <w:pPr>
-              <w:pStyle w:val="Compact"/>
-            </w:pPr>
-            <w:r>
-              <w:t xml:space="preserve">Assigned officer</w:t>
+              <w:t xml:space="preserve">/api/v1/reassignment-requests/{request}/decision</w:t>
+            </w:r>
+          </w:p>
+        </w:tc>
+        <w:tc>
+          <w:tcPr/>
+          <w:p>
+            <w:pPr>
+              <w:pStyle w:val="Compact"/>
+            </w:pPr>
+            <w:r>
+              <w:t xml:space="preserve">L2 approves or rejects a queued request; only an approval commits the move. Reached only where the category requires approval</w:t>
+            </w:r>
+          </w:p>
+        </w:tc>
+        <w:tc>
+          <w:tcPr/>
+          <w:p>
+            <w:pPr>
+              <w:pStyle w:val="Compact"/>
+            </w:pPr>
+            <w:r>
+              <w:t xml:space="preserve">L2 officer</w:t>
             </w:r>
           </w:p>
         </w:tc>
@@ -7990,99 +7485,7 @@
               <w:pStyle w:val="Compact"/>
             </w:pPr>
             <w:r>
-              <w:t xml:space="preserve">/api/v1/grievances/{ticket_number}/reassignment-requests</w:t>
-            </w:r>
-          </w:p>
-        </w:tc>
-        <w:tc>
-          <w:tcPr/>
-          <w:p>
-            <w:pPr>
-              <w:pStyle w:val="Compact"/>
-            </w:pPr>
-            <w:r>
-              <w:t xml:space="preserve">Move the case to another officer or department, reason mandatory. Commits immediately unless the category requires approval, in which case it queues for L2 and the target gains no rights until approved</w:t>
-            </w:r>
-          </w:p>
-        </w:tc>
-        <w:tc>
-          <w:tcPr/>
-          <w:p>
-            <w:pPr>
-              <w:pStyle w:val="Compact"/>
-            </w:pPr>
-            <w:r>
-              <w:t xml:space="preserve">L1 officer</w:t>
-            </w:r>
-          </w:p>
-        </w:tc>
-      </w:tr>
-      <w:tr>
-        <w:tc>
-          <w:tcPr/>
-          <w:p>
-            <w:pPr>
-              <w:pStyle w:val="Compact"/>
-            </w:pPr>
-            <w:r>
-              <w:t xml:space="preserve">POST</w:t>
-            </w:r>
-          </w:p>
-        </w:tc>
-        <w:tc>
-          <w:tcPr/>
-          <w:p>
-            <w:pPr>
-              <w:pStyle w:val="Compact"/>
-            </w:pPr>
-            <w:r>
-              <w:t xml:space="preserve">/api/v1/reassignment-requests/{request}/decision</w:t>
-            </w:r>
-          </w:p>
-        </w:tc>
-        <w:tc>
-          <w:tcPr/>
-          <w:p>
-            <w:pPr>
-              <w:pStyle w:val="Compact"/>
-            </w:pPr>
-            <w:r>
-              <w:t xml:space="preserve">L2 approves or rejects a queued request; only an approval commits the move. Reached only where the category requires approval</w:t>
-            </w:r>
-          </w:p>
-        </w:tc>
-        <w:tc>
-          <w:tcPr/>
-          <w:p>
-            <w:pPr>
-              <w:pStyle w:val="Compact"/>
-            </w:pPr>
-            <w:r>
-              <w:t xml:space="preserve">L2 officer</w:t>
-            </w:r>
-          </w:p>
-        </w:tc>
-      </w:tr>
-      <w:tr>
-        <w:tc>
-          <w:tcPr/>
-          <w:p>
-            <w:pPr>
-              <w:pStyle w:val="Compact"/>
-            </w:pPr>
-            <w:r>
-              <w:t xml:space="preserve">POST</w:t>
-            </w:r>
-          </w:p>
-        </w:tc>
-        <w:tc>
-          <w:tcPr/>
-          <w:p>
-            <w:pPr>
-              <w:pStyle w:val="Compact"/>
-            </w:pPr>
-            <w:r>
-              <w:t xml:space="preserve">/api/v1/grievances/{ticket_number}/anonymity-request</w:t>
+              <w:t xml:space="preserve">/api/v1/cases/{ticket_number}/anonymity-request</w:t>
             </w:r>
           </w:p>
         </w:tc>
@@ -8115,16 +7518,7 @@
         <w:pStyle w:val="BodyText"/>
       </w:pPr>
       <w:r>
-        <w:rPr>
-          <w:rStyle w:val="VerbatimChar"/>
-        </w:rPr>
-        <w:t xml:space="preserve">POST /{ticket}/response</w:t>
-      </w:r>
-      <w:r>
-        <w:t xml:space="preserve"> </w:t>
-      </w:r>
-      <w:r>
-        <w:t xml:space="preserve">is the significant one. Sequence 2.3 has the officer submitting a structured response as the step that produces the outcome the submitter then confirms or reopens, so it carries the response type that drives the next status — distinct from a free-text note or message, which changes nothing.</w:t>
+        <w:t xml:space="preserve">The primary case interactions are unified under POST /api/v1/cases/{ticket_number}/message (which handles notes, public conversation, info requests, and structured formal department responses driving next status) and POST /api/v1/cases/{ticket_number}/action (which executes state transitions such as Confirm, Reopen, Reject, Escalate, and Assign). The specialized operations above manage triage duplicates, SLA deferrals, multi-level reassignment approvals, and anonymity requests.</w:t>
       </w:r>
     </w:p>
     <w:bookmarkEnd w:id="78"/>
@@ -9034,7 +8428,7 @@
               <w:pStyle w:val="Compact"/>
             </w:pPr>
             <w:r>
-              <w:t xml:space="preserve">/api/v1/admin/organisation-requests</w:t>
+              <w:t xml:space="preserve">/api/v1/users/organisation-requests</w:t>
             </w:r>
           </w:p>
         </w:tc>
@@ -9080,7 +8474,7 @@
               <w:pStyle w:val="Compact"/>
             </w:pPr>
             <w:r>
-              <w:t xml:space="preserve">/api/v1/admin/organisation-requests/{request}</w:t>
+              <w:t xml:space="preserve">/api/v1/users/organisation-requests/{request}</w:t>
             </w:r>
           </w:p>
         </w:tc>
@@ -9126,7 +8520,7 @@
               <w:pStyle w:val="Compact"/>
             </w:pPr>
             <w:r>
-              <w:t xml:space="preserve">/api/v1/admin/organisation-requests/{request}/decision</w:t>
+              <w:t xml:space="preserve">/api/v1/users/organisation-requests/{request}/decision</w:t>
             </w:r>
           </w:p>
         </w:tc>
@@ -9287,7 +8681,7 @@
         <w:rPr>
           <w:rStyle w:val="VerbatimChar"/>
         </w:rPr>
-        <w:t xml:space="preserve">POST /api/v1/grievances</w:t>
+        <w:t xml:space="preserve">POST /api/v1/cases</w:t>
       </w:r>
       <w:r>
         <w:t xml:space="preserve"> </w:t>

</xml_diff>